<commit_message>
selfrecover v0.10.0: les textes disent la passphrase apportée
README, SECURITY, modèle de menace, architecture : la passphrase a deux
sources, le tirage du serveur ou les dés de l'utilisateur ; la bibliothèque
contrôle la forme, jamais le hasard, et la même passphrase scelle une serrure
du coffre SelfDataGuard. Une section dit à l'intégrateur quoi hacher et quoi
afficher. Whitepapers en v1.3 (§5.5 neuf, §11.5, §10.4, feuille de route),
DOCX régénérés ; whitepapers de SelfDataGuard sur l'entropie de la passphrase.

modules.json en 0.10.0 et ses porteurs, fiches diceware régénérées (licence
MIT de la liste française, renvoi au vérificateur hors ligne). CHANGELOG : la
v0.10.0, et l'entrée du jour qui disait les dés hors de la bibliothèque.

Co-Authored-By: Claude Opus 5.5 <noreply@anthropic.com>
</commit_message>
<xml_diff>
--- a/bi-self/selfrecover/docs/whitepaper-en.docx
+++ b/bi-self/selfrecover/docs/whitepaper-en.docx
@@ -2,13 +2,13 @@
 <file path=word/document.xml><?xml version="1.0" encoding="utf-8"?>
 <w:document xmlns:w="http://schemas.openxmlformats.org/wordprocessingml/2006/main" xmlns:m="http://schemas.openxmlformats.org/officeDocument/2006/math" xmlns:r="http://schemas.openxmlformats.org/officeDocument/2006/relationships" xmlns:o="urn:schemas-microsoft-com:office:office" xmlns:v="urn:schemas-microsoft-com:vml" xmlns:w10="urn:schemas-microsoft-com:office:word" xmlns:a="http://schemas.openxmlformats.org/drawingml/2006/main" xmlns:pic="http://schemas.openxmlformats.org/drawingml/2006/picture" xmlns:wp="http://schemas.openxmlformats.org/drawingml/2006/wordprocessingDrawing">
   <w:body>
-    <w:bookmarkStart w:id="62" w:name="selfrecover-whitepaper-v1.2"/>
+    <w:bookmarkStart w:id="63" w:name="selfrecover-whitepaper-v1.3"/>
     <w:p>
       <w:pPr>
         <w:pStyle w:val="Heading1"/>
       </w:pPr>
       <w:r>
-        <w:t xml:space="preserve">SelfRecover — Whitepaper v1.2</w:t>
+        <w:t xml:space="preserve">SelfRecover — Whitepaper v1.3</w:t>
       </w:r>
     </w:p>
     <w:p>
@@ -42,7 +42,7 @@
           <w:i/>
           <w:iCs/>
         </w:rPr>
-        <w:t xml:space="preserve">Edition of 4 October 2026 — v1.2 — describes SelfRecover 0.9.0</w:t>
+        <w:t xml:space="preserve">Edition of 4 October 2026 — v1.3 — describes SelfRecover 0.10.0</w:t>
       </w:r>
     </w:p>
     <w:p>
@@ -365,7 +365,7 @@
         <w:t xml:space="preserve"> </w:t>
       </w:r>
       <w:r>
-        <w:t xml:space="preserve">their recovery codes (level 2) and their diceware passphrase (level 1). They are drawn at random; nobody has to remember them.</w:t>
+        <w:t xml:space="preserve">their recovery codes (level 2) and their diceware passphrase (level 1). They are drawn at random — by the server, or with dice by the user for the passphrase (§5.5); nobody has to remember them.</w:t>
       </w:r>
     </w:p>
     <w:p>
@@ -485,7 +485,7 @@
         <w:t xml:space="preserve"> </w:t>
       </w:r>
       <w:r>
-        <w:t xml:space="preserve">— a diceware passphrase generated server-side (6 words, ≈ 77.5 bits of entropy; a shorter passphrase issued before the move to six words stays valid until used)</w:t>
+        <w:t xml:space="preserve">— a diceware passphrase, generated server-side or brought by the user, rolled with dice (§5.5) (6 words or more, ≈ 77.5 bits for six uniformly drawn words; a shorter passphrase issued before the move to six words stays valid until used)</w:t>
       </w:r>
     </w:p>
     <w:p>
@@ -2862,7 +2862,7 @@
     </w:p>
     <w:bookmarkEnd w:id="29"/>
     <w:bookmarkEnd w:id="30"/>
-    <w:bookmarkStart w:id="35" w:name="three-level-recovery-escalation"/>
+    <w:bookmarkStart w:id="36" w:name="three-level-recovery-escalation"/>
     <w:p>
       <w:pPr>
         <w:pStyle w:val="Heading2"/>
@@ -4175,6 +4175,264 @@
       </w:r>
       <w:r>
         <w:t xml:space="preserve">- A level-3 reset removes every enrolled device; levels 1 and 2 do not.</w:t>
+      </w:r>
+    </w:p>
+    <w:bookmarkEnd w:id="34"/>
+    <w:bookmarkStart w:id="35" w:name="Xd043ed50251bcf9cfe2fe65a0fd7d02301ba0f6"/>
+    <w:p>
+      <w:pPr>
+        <w:pStyle w:val="Heading3"/>
+      </w:pPr>
+      <w:r>
+        <w:t xml:space="preserve">5.5 A passphrase the user brings — the user’s choice</w:t>
+      </w:r>
+    </w:p>
+    <w:p>
+      <w:pPr>
+        <w:pStyle w:val="FirstParagraph"/>
+      </w:pPr>
+      <w:r>
+        <w:t xml:space="preserve">Wherever a passphrase is issued — at registration, and at the level 1, 2 and 3 renewals —, the user</w:t>
+      </w:r>
+      <w:r>
+        <w:t xml:space="preserve"> </w:t>
+      </w:r>
+      <w:r>
+        <w:t xml:space="preserve">may bring their own, rolled with dice, instead of receiving one drawn by the server. Nothing brought:</w:t>
+      </w:r>
+      <w:r>
+        <w:t xml:space="preserve"> </w:t>
+      </w:r>
+      <w:r>
+        <w:t xml:space="preserve">the server draws, as before.</w:t>
+      </w:r>
+    </w:p>
+    <w:p>
+      <w:pPr>
+        <w:pStyle w:val="Compact"/>
+        <w:numPr>
+          <w:ilvl w:val="0"/>
+          <w:numId w:val="1008"/>
+        </w:numPr>
+      </w:pPr>
+      <w:r>
+        <w:rPr>
+          <w:b/>
+          <w:bCs/>
+        </w:rPr>
+        <w:t xml:space="preserve">The check</w:t>
+      </w:r>
+      <w:r>
+        <w:t xml:space="preserve"> </w:t>
+      </w:r>
+      <w:r>
+        <w:t xml:space="preserve">(</w:t>
+      </w:r>
+      <w:r>
+        <w:rPr>
+          <w:rStyle w:val="VerbatimChar"/>
+        </w:rPr>
+        <w:t xml:space="preserve">Recovery::validerPassphraseApportee()</w:t>
+      </w:r>
+      <w:r>
+        <w:t xml:space="preserve">): six words or more, each from the EFF English</w:t>
+      </w:r>
+      <w:r>
+        <w:t xml:space="preserve"> </w:t>
+      </w:r>
+      <w:r>
+        <w:t xml:space="preserve">list or from Arthur Pons’s French list, none repeated, a byte ceiling. The passphrase is stored in a</w:t>
+      </w:r>
+      <w:r>
+        <w:t xml:space="preserve"> </w:t>
+      </w:r>
+      <w:r>
+        <w:t xml:space="preserve">single form: lowercase, one space between words. That form is the one hashed, returned and written</w:t>
+      </w:r>
+      <w:r>
+        <w:t xml:space="preserve"> </w:t>
+      </w:r>
+      <w:r>
+        <w:t xml:space="preserve">down, because verification does not lowercase.</w:t>
+      </w:r>
+    </w:p>
+    <w:p>
+      <w:pPr>
+        <w:pStyle w:val="Compact"/>
+        <w:numPr>
+          <w:ilvl w:val="0"/>
+          <w:numId w:val="1008"/>
+        </w:numPr>
+      </w:pPr>
+      <w:r>
+        <w:rPr>
+          <w:b/>
+          <w:bCs/>
+        </w:rPr>
+        <w:t xml:space="preserve">A refusal</w:t>
+      </w:r>
+      <w:r>
+        <w:t xml:space="preserve"> </w:t>
+      </w:r>
+      <w:r>
+        <w:t xml:space="preserve">gives a word’s position, never the word. It is judged before any brake, with no trace</w:t>
+      </w:r>
+      <w:r>
+        <w:t xml:space="preserve"> </w:t>
+      </w:r>
+      <w:r>
+        <w:t xml:space="preserve">and no delay: it depends only on the input, not on the account, and tracing it would let anyone</w:t>
+      </w:r>
+      <w:r>
+        <w:t xml:space="preserve"> </w:t>
+      </w:r>
+      <w:r>
+        <w:t xml:space="preserve">charge someone else’s brake. It consumes neither the level-2 code nor the level-3 case.</w:t>
+      </w:r>
+    </w:p>
+    <w:p>
+      <w:pPr>
+        <w:pStyle w:val="Compact"/>
+        <w:numPr>
+          <w:ilvl w:val="0"/>
+          <w:numId w:val="1008"/>
+        </w:numPr>
+      </w:pPr>
+      <w:r>
+        <w:rPr>
+          <w:b/>
+          <w:bCs/>
+        </w:rPr>
+        <w:t xml:space="preserve">The old passphrase does not come back</w:t>
+      </w:r>
+      <w:r>
+        <w:t xml:space="preserve">: at every level, a brought passphrase equal to the one it</w:t>
+      </w:r>
+      <w:r>
+        <w:t xml:space="preserve"> </w:t>
+      </w:r>
+      <w:r>
+        <w:t xml:space="preserve">replaces is refused. At level 3 it also cannot equal the chosen password.</w:t>
+      </w:r>
+    </w:p>
+    <w:p>
+      <w:pPr>
+        <w:pStyle w:val="Compact"/>
+        <w:numPr>
+          <w:ilvl w:val="0"/>
+          <w:numId w:val="1008"/>
+        </w:numPr>
+      </w:pPr>
+      <w:r>
+        <w:rPr>
+          <w:b/>
+          <w:bCs/>
+        </w:rPr>
+        <w:t xml:space="preserve">What the check does not measure: randomness.</w:t>
+      </w:r>
+      <w:r>
+        <w:t xml:space="preserve"> </w:t>
+      </w:r>
+      <w:r>
+        <w:t xml:space="preserve">Six words picked by hand pass, and are worth less</w:t>
+      </w:r>
+      <w:r>
+        <w:t xml:space="preserve"> </w:t>
+      </w:r>
+      <w:r>
+        <w:t xml:space="preserve">than six rolled words. The same passphrase seals the</w:t>
+      </w:r>
+      <w:r>
+        <w:t xml:space="preserve"> </w:t>
+      </w:r>
+      <w:r>
+        <w:t xml:space="preserve">“</w:t>
+      </w:r>
+      <w:r>
+        <w:t xml:space="preserve">passphrase</w:t>
+      </w:r>
+      <w:r>
+        <w:t xml:space="preserve">”</w:t>
+      </w:r>
+      <w:r>
+        <w:t xml:space="preserve"> </w:t>
+      </w:r>
+      <w:r>
+        <w:t xml:space="preserve">lock of the SelfDataGuard vault,</w:t>
+      </w:r>
+      <w:r>
+        <w:t xml:space="preserve"> </w:t>
+      </w:r>
+      <w:r>
+        <w:t xml:space="preserve">which is attacked offline: a guessable passphrase becomes the cheapest way in.</w:t>
+      </w:r>
+    </w:p>
+    <w:p>
+      <w:pPr>
+        <w:pStyle w:val="FirstParagraph"/>
+      </w:pPr>
+      <w:r>
+        <w:t xml:space="preserve">At registration, which belongs to the application, it passes the input to the check and hashes the</w:t>
+      </w:r>
+      <w:r>
+        <w:t xml:space="preserve"> </w:t>
+      </w:r>
+      <w:r>
+        <w:t xml:space="preserve">returned form. At renewals, it passes it as</w:t>
+      </w:r>
+      <w:r>
+        <w:t xml:space="preserve"> </w:t>
+      </w:r>
+      <w:r>
+        <w:rPr>
+          <w:rStyle w:val="VerbatimChar"/>
+        </w:rPr>
+        <w:t xml:space="preserve">nouvellePassphrase</w:t>
+      </w:r>
+      <w:r>
+        <w:t xml:space="preserve"> </w:t>
+      </w:r>
+      <w:r>
+        <w:t xml:space="preserve">to</w:t>
+      </w:r>
+      <w:r>
+        <w:t xml:space="preserve"> </w:t>
+      </w:r>
+      <w:r>
+        <w:rPr>
+          <w:rStyle w:val="VerbatimChar"/>
+        </w:rPr>
+        <w:t xml:space="preserve">parPassphrase()</w:t>
+      </w:r>
+      <w:r>
+        <w:t xml:space="preserve">,</w:t>
+      </w:r>
+      <w:r>
+        <w:t xml:space="preserve"> </w:t>
+      </w:r>
+      <w:r>
+        <w:rPr>
+          <w:rStyle w:val="VerbatimChar"/>
+        </w:rPr>
+        <w:t xml:space="preserve">parCode()</w:t>
+      </w:r>
+      <w:r>
+        <w:t xml:space="preserve"> </w:t>
+      </w:r>
+      <w:r>
+        <w:t xml:space="preserve">or</w:t>
+      </w:r>
+      <w:r>
+        <w:t xml:space="preserve"> </w:t>
+      </w:r>
+      <w:r>
+        <w:rPr>
+          <w:rStyle w:val="VerbatimChar"/>
+        </w:rPr>
+        <w:t xml:space="preserve">Escalade::reEnroler()</w:t>
+      </w:r>
+      <w:r>
+        <w:t xml:space="preserve">.</w:t>
       </w:r>
     </w:p>
     <w:p>
@@ -4184,9 +4442,9 @@
         </w:pict>
       </w:r>
     </w:p>
-    <w:bookmarkEnd w:id="34"/>
     <w:bookmarkEnd w:id="35"/>
-    <w:bookmarkStart w:id="38" w:name="dispute-system-admin-interface"/>
+    <w:bookmarkEnd w:id="36"/>
+    <w:bookmarkStart w:id="39" w:name="dispute-system-admin-interface"/>
     <w:p>
       <w:pPr>
         <w:pStyle w:val="Heading2"/>
@@ -4229,7 +4487,7 @@
         <w:pStyle w:val="Compact"/>
         <w:numPr>
           <w:ilvl w:val="0"/>
-          <w:numId w:val="1008"/>
+          <w:numId w:val="1009"/>
         </w:numPr>
       </w:pPr>
       <w:r>
@@ -4326,7 +4584,7 @@
         <w:pStyle w:val="Compact"/>
         <w:numPr>
           <w:ilvl w:val="0"/>
-          <w:numId w:val="1008"/>
+          <w:numId w:val="1009"/>
         </w:numPr>
       </w:pPr>
       <w:r>
@@ -4338,7 +4596,7 @@
         <w:pStyle w:val="Compact"/>
         <w:numPr>
           <w:ilvl w:val="0"/>
-          <w:numId w:val="1008"/>
+          <w:numId w:val="1009"/>
         </w:numPr>
       </w:pPr>
       <w:r>
@@ -4350,7 +4608,7 @@
         <w:pStyle w:val="Compact"/>
         <w:numPr>
           <w:ilvl w:val="0"/>
-          <w:numId w:val="1008"/>
+          <w:numId w:val="1009"/>
         </w:numPr>
       </w:pPr>
       <w:r>
@@ -4379,7 +4637,7 @@
         <w:t xml:space="preserve">. Calling it is the deployment’s job, from a scheduled task.</w:t>
       </w:r>
     </w:p>
-    <w:bookmarkStart w:id="36" w:name="dispute-closure-admin-decision"/>
+    <w:bookmarkStart w:id="37" w:name="dispute-closure-admin-decision"/>
     <w:p>
       <w:pPr>
         <w:pStyle w:val="Heading3"/>
@@ -4413,7 +4671,7 @@
         <w:pStyle w:val="Compact"/>
         <w:numPr>
           <w:ilvl w:val="0"/>
-          <w:numId w:val="1009"/>
+          <w:numId w:val="1010"/>
         </w:numPr>
       </w:pPr>
       <w:r>
@@ -4425,7 +4683,7 @@
         <w:pStyle w:val="Compact"/>
         <w:numPr>
           <w:ilvl w:val="0"/>
-          <w:numId w:val="1009"/>
+          <w:numId w:val="1010"/>
         </w:numPr>
       </w:pPr>
       <w:r>
@@ -4462,7 +4720,7 @@
         <w:pStyle w:val="Compact"/>
         <w:numPr>
           <w:ilvl w:val="0"/>
-          <w:numId w:val="1009"/>
+          <w:numId w:val="1010"/>
         </w:numPr>
       </w:pPr>
       <w:r>
@@ -4482,7 +4740,7 @@
         <w:t xml:space="preserve"> </w:t>
       </w:r>
       <w:r>
-        <w:t xml:space="preserve">password and memorized word from their recovery page (re-enrollment model). The password is 12 to 4,096 characters; it is submitted in the clear, and the server files it without issuing it. The browser generates a new salt and derives the memorized word, which never arrives in the clear. The server generates a passphrase and 10 codes, shown once, drops open sessions and removes every enrolled device — the holder re-enrolls the one they use. The dispute moves to</w:t>
+        <w:t xml:space="preserve">password and memorized word from their recovery page (re-enrollment model). The password is 12 to 4,096 characters; it is submitted in the clear, and the server files it without issuing it. The browser generates a new salt and derives the memorized word, which never arrives in the clear. The server generates 10 codes, and a passphrase unless the holder brings their own (§5.5), shown once, drops open sessions and removes every enrolled device — the holder re-enrolls the one they use. The dispute moves to</w:t>
       </w:r>
       <w:r>
         <w:t xml:space="preserve"> </w:t>
@@ -4517,7 +4775,7 @@
         <w:pStyle w:val="Compact"/>
         <w:numPr>
           <w:ilvl w:val="0"/>
-          <w:numId w:val="1010"/>
+          <w:numId w:val="1011"/>
         </w:numPr>
       </w:pPr>
       <w:r>
@@ -4529,7 +4787,7 @@
         <w:pStyle w:val="Compact"/>
         <w:numPr>
           <w:ilvl w:val="0"/>
-          <w:numId w:val="1010"/>
+          <w:numId w:val="1011"/>
         </w:numPr>
       </w:pPr>
       <w:r>
@@ -4553,7 +4811,7 @@
         <w:pStyle w:val="Compact"/>
         <w:numPr>
           <w:ilvl w:val="0"/>
-          <w:numId w:val="1010"/>
+          <w:numId w:val="1011"/>
         </w:numPr>
       </w:pPr>
       <w:r>
@@ -4572,7 +4830,7 @@
         <w:pStyle w:val="Compact"/>
         <w:numPr>
           <w:ilvl w:val="0"/>
-          <w:numId w:val="1010"/>
+          <w:numId w:val="1011"/>
         </w:numPr>
       </w:pPr>
       <w:r>
@@ -4719,8 +4977,8 @@
         <w:t xml:space="preserve">, not submissions: three submissions within one case remain one refusal, otherwise an honest owner’s persistence would trip the freeze as fast as a hostile campaign.</w:t>
       </w:r>
     </w:p>
-    <w:bookmarkEnd w:id="36"/>
-    <w:bookmarkStart w:id="37" w:name="X1bfafa217b99aef94406c0117c2207010598b97"/>
+    <w:bookmarkEnd w:id="37"/>
+    <w:bookmarkStart w:id="38" w:name="X1bfafa217b99aef94406c0117c2207010598b97"/>
     <w:p>
       <w:pPr>
         <w:pStyle w:val="Heading3"/>
@@ -5220,9 +5478,9 @@
         </w:pict>
       </w:r>
     </w:p>
-    <w:bookmarkEnd w:id="37"/>
     <w:bookmarkEnd w:id="38"/>
-    <w:bookmarkStart w:id="39" w:name="anti-abuse-detection"/>
+    <w:bookmarkEnd w:id="39"/>
+    <w:bookmarkStart w:id="40" w:name="anti-abuse-detection"/>
     <w:p>
       <w:pPr>
         <w:pStyle w:val="Heading2"/>
@@ -5248,7 +5506,7 @@
         <w:pStyle w:val="Compact"/>
         <w:numPr>
           <w:ilvl w:val="0"/>
-          <w:numId w:val="1011"/>
+          <w:numId w:val="1012"/>
         </w:numPr>
       </w:pPr>
       <w:r>
@@ -5282,7 +5540,7 @@
         <w:pStyle w:val="Compact"/>
         <w:numPr>
           <w:ilvl w:val="0"/>
-          <w:numId w:val="1011"/>
+          <w:numId w:val="1012"/>
         </w:numPr>
       </w:pPr>
       <w:r>
@@ -5304,7 +5562,7 @@
         <w:pStyle w:val="Compact"/>
         <w:numPr>
           <w:ilvl w:val="0"/>
-          <w:numId w:val="1011"/>
+          <w:numId w:val="1012"/>
         </w:numPr>
       </w:pPr>
       <w:r>
@@ -5358,8 +5616,8 @@
         </w:pict>
       </w:r>
     </w:p>
-    <w:bookmarkEnd w:id="39"/>
-    <w:bookmarkStart w:id="40" w:name="what-the-library-returns"/>
+    <w:bookmarkEnd w:id="40"/>
+    <w:bookmarkStart w:id="41" w:name="what-the-library-returns"/>
     <w:p>
       <w:pPr>
         <w:pStyle w:val="Heading2"/>
@@ -5577,8 +5835,8 @@
         </w:pict>
       </w:r>
     </w:p>
-    <w:bookmarkEnd w:id="40"/>
-    <w:bookmarkStart w:id="41" w:name="protection-against-active-attacks"/>
+    <w:bookmarkEnd w:id="41"/>
+    <w:bookmarkStart w:id="42" w:name="protection-against-active-attacks"/>
     <w:p>
       <w:pPr>
         <w:pStyle w:val="Heading2"/>
@@ -5654,7 +5912,7 @@
         <w:pStyle w:val="Compact"/>
         <w:numPr>
           <w:ilvl w:val="0"/>
-          <w:numId w:val="1012"/>
+          <w:numId w:val="1013"/>
         </w:numPr>
       </w:pPr>
       <w:r>
@@ -5676,7 +5934,7 @@
         <w:pStyle w:val="Compact"/>
         <w:numPr>
           <w:ilvl w:val="0"/>
-          <w:numId w:val="1012"/>
+          <w:numId w:val="1013"/>
         </w:numPr>
       </w:pPr>
       <w:r>
@@ -5698,7 +5956,7 @@
         <w:pStyle w:val="Compact"/>
         <w:numPr>
           <w:ilvl w:val="1"/>
-          <w:numId w:val="1013"/>
+          <w:numId w:val="1014"/>
         </w:numPr>
       </w:pPr>
       <w:r>
@@ -5710,7 +5968,7 @@
         <w:pStyle w:val="Compact"/>
         <w:numPr>
           <w:ilvl w:val="1"/>
-          <w:numId w:val="1013"/>
+          <w:numId w:val="1014"/>
         </w:numPr>
       </w:pPr>
       <w:r>
@@ -5722,7 +5980,7 @@
         <w:pStyle w:val="Compact"/>
         <w:numPr>
           <w:ilvl w:val="1"/>
-          <w:numId w:val="1013"/>
+          <w:numId w:val="1014"/>
         </w:numPr>
       </w:pPr>
       <w:r>
@@ -5762,8 +6020,8 @@
         </w:pict>
       </w:r>
     </w:p>
-    <w:bookmarkEnd w:id="41"/>
-    <w:bookmarkStart w:id="46" w:name="threat-model-limitations"/>
+    <w:bookmarkEnd w:id="42"/>
+    <w:bookmarkStart w:id="47" w:name="threat-model-limitations"/>
     <w:p>
       <w:pPr>
         <w:pStyle w:val="Heading2"/>
@@ -5772,7 +6030,7 @@
         <w:t xml:space="preserve">10. Threat Model &amp; Limitations</w:t>
       </w:r>
     </w:p>
-    <w:bookmarkStart w:id="42" w:name="threats-addressed"/>
+    <w:bookmarkStart w:id="43" w:name="threats-addressed"/>
     <w:p>
       <w:pPr>
         <w:pStyle w:val="Heading3"/>
@@ -5786,7 +6044,7 @@
         <w:pStyle w:val="Compact"/>
         <w:numPr>
           <w:ilvl w:val="0"/>
-          <w:numId w:val="1014"/>
+          <w:numId w:val="1015"/>
         </w:numPr>
       </w:pPr>
       <w:r>
@@ -5838,7 +6096,7 @@
         <w:pStyle w:val="Compact"/>
         <w:numPr>
           <w:ilvl w:val="0"/>
-          <w:numId w:val="1014"/>
+          <w:numId w:val="1015"/>
         </w:numPr>
       </w:pPr>
       <w:r>
@@ -5860,7 +6118,7 @@
         <w:pStyle w:val="Compact"/>
         <w:numPr>
           <w:ilvl w:val="0"/>
-          <w:numId w:val="1014"/>
+          <w:numId w:val="1015"/>
         </w:numPr>
       </w:pPr>
       <w:r>
@@ -5882,7 +6140,7 @@
         <w:pStyle w:val="Compact"/>
         <w:numPr>
           <w:ilvl w:val="0"/>
-          <w:numId w:val="1014"/>
+          <w:numId w:val="1015"/>
         </w:numPr>
       </w:pPr>
       <w:r>
@@ -5904,7 +6162,7 @@
         <w:pStyle w:val="Compact"/>
         <w:numPr>
           <w:ilvl w:val="0"/>
-          <w:numId w:val="1014"/>
+          <w:numId w:val="1015"/>
         </w:numPr>
       </w:pPr>
       <w:r>
@@ -5926,7 +6184,7 @@
         <w:pStyle w:val="Compact"/>
         <w:numPr>
           <w:ilvl w:val="0"/>
-          <w:numId w:val="1014"/>
+          <w:numId w:val="1015"/>
         </w:numPr>
       </w:pPr>
       <w:r>
@@ -5961,7 +6219,7 @@
         <w:pStyle w:val="Compact"/>
         <w:numPr>
           <w:ilvl w:val="0"/>
-          <w:numId w:val="1014"/>
+          <w:numId w:val="1015"/>
         </w:numPr>
       </w:pPr>
       <w:r>
@@ -5978,8 +6236,8 @@
         <w:t xml:space="preserve">— the library offers no account rename; locking the name after registration is the application’s to enforce</w:t>
       </w:r>
     </w:p>
-    <w:bookmarkEnd w:id="42"/>
-    <w:bookmarkStart w:id="43" w:name="critical-server-root-access-sudo"/>
+    <w:bookmarkEnd w:id="43"/>
+    <w:bookmarkStart w:id="44" w:name="critical-server-root-access-sudo"/>
     <w:p>
       <w:pPr>
         <w:pStyle w:val="Heading3"/>
@@ -6038,7 +6296,7 @@
         <w:pStyle w:val="Compact"/>
         <w:numPr>
           <w:ilvl w:val="0"/>
-          <w:numId w:val="1015"/>
+          <w:numId w:val="1016"/>
         </w:numPr>
       </w:pPr>
       <w:r>
@@ -6164,7 +6422,7 @@
         <w:pStyle w:val="Compact"/>
         <w:numPr>
           <w:ilvl w:val="0"/>
-          <w:numId w:val="1015"/>
+          <w:numId w:val="1016"/>
         </w:numPr>
       </w:pPr>
       <w:r>
@@ -6176,7 +6434,7 @@
         <w:pStyle w:val="Compact"/>
         <w:numPr>
           <w:ilvl w:val="0"/>
-          <w:numId w:val="1015"/>
+          <w:numId w:val="1016"/>
         </w:numPr>
       </w:pPr>
       <w:r>
@@ -6208,7 +6466,7 @@
         <w:pStyle w:val="Compact"/>
         <w:numPr>
           <w:ilvl w:val="0"/>
-          <w:numId w:val="1016"/>
+          <w:numId w:val="1017"/>
         </w:numPr>
       </w:pPr>
       <w:r>
@@ -6235,7 +6493,7 @@
         <w:pStyle w:val="Compact"/>
         <w:numPr>
           <w:ilvl w:val="0"/>
-          <w:numId w:val="1016"/>
+          <w:numId w:val="1017"/>
         </w:numPr>
       </w:pPr>
       <w:r>
@@ -6247,7 +6505,7 @@
         <w:pStyle w:val="Compact"/>
         <w:numPr>
           <w:ilvl w:val="0"/>
-          <w:numId w:val="1016"/>
+          <w:numId w:val="1017"/>
         </w:numPr>
       </w:pPr>
       <w:r>
@@ -6268,7 +6526,7 @@
         <w:pStyle w:val="Compact"/>
         <w:numPr>
           <w:ilvl w:val="0"/>
-          <w:numId w:val="1016"/>
+          <w:numId w:val="1017"/>
         </w:numPr>
       </w:pPr>
       <w:r>
@@ -6280,7 +6538,7 @@
         <w:pStyle w:val="Compact"/>
         <w:numPr>
           <w:ilvl w:val="0"/>
-          <w:numId w:val="1016"/>
+          <w:numId w:val="1017"/>
         </w:numPr>
       </w:pPr>
       <w:r>
@@ -6493,8 +6751,8 @@
         <w:t xml:space="preserve">This rule is non-negotiable.</w:t>
       </w:r>
     </w:p>
-    <w:bookmarkEnd w:id="43"/>
-    <w:bookmarkStart w:id="44" w:name="X2f1bf8a7bbcb281955f474219b42d1986fb706e"/>
+    <w:bookmarkEnd w:id="44"/>
+    <w:bookmarkStart w:id="45" w:name="X2f1bf8a7bbcb281955f474219b42d1986fb706e"/>
     <w:p>
       <w:pPr>
         <w:pStyle w:val="Heading3"/>
@@ -6636,7 +6894,7 @@
         <w:pStyle w:val="Compact"/>
         <w:numPr>
           <w:ilvl w:val="0"/>
-          <w:numId w:val="1017"/>
+          <w:numId w:val="1018"/>
         </w:numPr>
       </w:pPr>
       <w:r>
@@ -6648,7 +6906,7 @@
         <w:pStyle w:val="Compact"/>
         <w:numPr>
           <w:ilvl w:val="0"/>
-          <w:numId w:val="1017"/>
+          <w:numId w:val="1018"/>
         </w:numPr>
       </w:pPr>
       <w:r>
@@ -6690,7 +6948,7 @@
         <w:pStyle w:val="Compact"/>
         <w:numPr>
           <w:ilvl w:val="0"/>
-          <w:numId w:val="1017"/>
+          <w:numId w:val="1018"/>
         </w:numPr>
       </w:pPr>
       <w:r>
@@ -6702,7 +6960,7 @@
         <w:pStyle w:val="Compact"/>
         <w:numPr>
           <w:ilvl w:val="0"/>
-          <w:numId w:val="1017"/>
+          <w:numId w:val="1018"/>
         </w:numPr>
       </w:pPr>
       <w:r>
@@ -6727,8 +6985,8 @@
         <w:t xml:space="preserve">This is not a flaw — it is the fundamental contract of any secret-based security system.</w:t>
       </w:r>
     </w:p>
-    <w:bookmarkEnd w:id="44"/>
-    <w:bookmarkStart w:id="45" w:name="other-limitations-by-design"/>
+    <w:bookmarkEnd w:id="45"/>
+    <w:bookmarkStart w:id="46" w:name="other-limitations-by-design"/>
     <w:p>
       <w:pPr>
         <w:pStyle w:val="Heading3"/>
@@ -6742,11 +7000,23 @@
         <w:pStyle w:val="Compact"/>
         <w:numPr>
           <w:ilvl w:val="0"/>
-          <w:numId w:val="1018"/>
+          <w:numId w:val="1019"/>
         </w:numPr>
       </w:pPr>
       <w:r>
         <w:t xml:space="preserve">If the user forgot their memorized word and lost their passphrase, only level 3 is left: a human arbitrator. If the arbitrator refuses there is no other recourse; a new dispute stays possible until the 7-day freeze, on the 3rd refusal in 30 days</w:t>
+      </w:r>
+    </w:p>
+    <w:p>
+      <w:pPr>
+        <w:pStyle w:val="Compact"/>
+        <w:numPr>
+          <w:ilvl w:val="0"/>
+          <w:numId w:val="1019"/>
+        </w:numPr>
+      </w:pPr>
+      <w:r>
+        <w:t xml:space="preserve">A passphrase the user brings is only as random as its dice, which the library cannot check (§5.5)</w:t>
       </w:r>
     </w:p>
     <w:p>
@@ -6764,9 +7034,9 @@
         </w:pict>
       </w:r>
     </w:p>
-    <w:bookmarkEnd w:id="45"/>
     <w:bookmarkEnd w:id="46"/>
-    <w:bookmarkStart w:id="52" w:name="deployment-security-checklist"/>
+    <w:bookmarkEnd w:id="47"/>
+    <w:bookmarkStart w:id="53" w:name="deployment-security-checklist"/>
     <w:p>
       <w:pPr>
         <w:pStyle w:val="Heading2"/>
@@ -6799,7 +7069,7 @@
         <w:t xml:space="preserve">before any production deployment.</w:t>
       </w:r>
     </w:p>
-    <w:bookmarkStart w:id="47" w:name="server-access"/>
+    <w:bookmarkStart w:id="48" w:name="server-access"/>
     <w:p>
       <w:pPr>
         <w:pStyle w:val="Heading3"/>
@@ -6813,7 +7083,7 @@
         <w:pStyle w:val="Compact"/>
         <w:numPr>
           <w:ilvl w:val="0"/>
-          <w:numId w:val="1019"/>
+          <w:numId w:val="1020"/>
         </w:numPr>
       </w:pPr>
       <w:r>
@@ -6840,7 +7110,7 @@
         <w:pStyle w:val="Compact"/>
         <w:numPr>
           <w:ilvl w:val="0"/>
-          <w:numId w:val="1019"/>
+          <w:numId w:val="1020"/>
         </w:numPr>
       </w:pPr>
       <w:r>
@@ -6861,15 +7131,15 @@
         <w:pStyle w:val="Compact"/>
         <w:numPr>
           <w:ilvl w:val="0"/>
-          <w:numId w:val="1019"/>
+          <w:numId w:val="1020"/>
         </w:numPr>
       </w:pPr>
       <w:r>
         <w:t xml:space="preserve">☐ Firewall active (UFW / iptables) — only expose ports 80, 443, and SSH</w:t>
       </w:r>
     </w:p>
-    <w:bookmarkEnd w:id="47"/>
-    <w:bookmarkStart w:id="48" w:name="database"/>
+    <w:bookmarkEnd w:id="48"/>
+    <w:bookmarkStart w:id="49" w:name="database"/>
     <w:p>
       <w:pPr>
         <w:pStyle w:val="Heading3"/>
@@ -6883,7 +7153,7 @@
         <w:pStyle w:val="Compact"/>
         <w:numPr>
           <w:ilvl w:val="0"/>
-          <w:numId w:val="1020"/>
+          <w:numId w:val="1021"/>
         </w:numPr>
       </w:pPr>
       <w:r>
@@ -6895,7 +7165,7 @@
         <w:pStyle w:val="Compact"/>
         <w:numPr>
           <w:ilvl w:val="0"/>
-          <w:numId w:val="1020"/>
+          <w:numId w:val="1021"/>
         </w:numPr>
       </w:pPr>
       <w:r>
@@ -6979,7 +7249,7 @@
         <w:pStyle w:val="Compact"/>
         <w:numPr>
           <w:ilvl w:val="0"/>
-          <w:numId w:val="1020"/>
+          <w:numId w:val="1021"/>
         </w:numPr>
       </w:pPr>
       <w:r>
@@ -6991,7 +7261,7 @@
         <w:pStyle w:val="Compact"/>
         <w:numPr>
           <w:ilvl w:val="0"/>
-          <w:numId w:val="1020"/>
+          <w:numId w:val="1021"/>
         </w:numPr>
       </w:pPr>
       <w:r>
@@ -7003,15 +7273,15 @@
         <w:pStyle w:val="Compact"/>
         <w:numPr>
           <w:ilvl w:val="0"/>
-          <w:numId w:val="1020"/>
+          <w:numId w:val="1021"/>
         </w:numPr>
       </w:pPr>
       <w:r>
         <w:t xml:space="preserve">☐ Backup storage isolated from web root — not accessible via HTTP</w:t>
       </w:r>
     </w:p>
-    <w:bookmarkEnd w:id="48"/>
-    <w:bookmarkStart w:id="49" w:name="application"/>
+    <w:bookmarkEnd w:id="49"/>
+    <w:bookmarkStart w:id="50" w:name="application"/>
     <w:p>
       <w:pPr>
         <w:pStyle w:val="Heading3"/>
@@ -7025,7 +7295,7 @@
         <w:pStyle w:val="Compact"/>
         <w:numPr>
           <w:ilvl w:val="0"/>
-          <w:numId w:val="1021"/>
+          <w:numId w:val="1022"/>
         </w:numPr>
       </w:pPr>
       <w:r>
@@ -7052,7 +7322,7 @@
         <w:pStyle w:val="Compact"/>
         <w:numPr>
           <w:ilvl w:val="0"/>
-          <w:numId w:val="1021"/>
+          <w:numId w:val="1022"/>
         </w:numPr>
       </w:pPr>
       <w:r>
@@ -7079,7 +7349,7 @@
         <w:pStyle w:val="Compact"/>
         <w:numPr>
           <w:ilvl w:val="0"/>
-          <w:numId w:val="1021"/>
+          <w:numId w:val="1022"/>
         </w:numPr>
       </w:pPr>
       <w:r>
@@ -7091,7 +7361,7 @@
         <w:pStyle w:val="Compact"/>
         <w:numPr>
           <w:ilvl w:val="0"/>
-          <w:numId w:val="1021"/>
+          <w:numId w:val="1022"/>
         </w:numPr>
       </w:pPr>
       <w:r>
@@ -7136,15 +7406,15 @@
         <w:pStyle w:val="Compact"/>
         <w:numPr>
           <w:ilvl w:val="0"/>
-          <w:numId w:val="1021"/>
+          <w:numId w:val="1022"/>
         </w:numPr>
       </w:pPr>
       <w:r>
         <w:t xml:space="preserve">☐ Init and migration scripts blocked in production (deny all or remove)</w:t>
       </w:r>
     </w:p>
-    <w:bookmarkEnd w:id="49"/>
-    <w:bookmarkStart w:id="50" w:name="monitoring"/>
+    <w:bookmarkEnd w:id="50"/>
+    <w:bookmarkStart w:id="51" w:name="monitoring"/>
     <w:p>
       <w:pPr>
         <w:pStyle w:val="Heading3"/>
@@ -7158,7 +7428,7 @@
         <w:pStyle w:val="Compact"/>
         <w:numPr>
           <w:ilvl w:val="0"/>
-          <w:numId w:val="1022"/>
+          <w:numId w:val="1023"/>
         </w:numPr>
       </w:pPr>
       <w:r>
@@ -7170,7 +7440,7 @@
         <w:pStyle w:val="Compact"/>
         <w:numPr>
           <w:ilvl w:val="0"/>
-          <w:numId w:val="1022"/>
+          <w:numId w:val="1023"/>
         </w:numPr>
       </w:pPr>
       <w:r>
@@ -7182,15 +7452,15 @@
         <w:pStyle w:val="Compact"/>
         <w:numPr>
           <w:ilvl w:val="0"/>
-          <w:numId w:val="1022"/>
+          <w:numId w:val="1023"/>
         </w:numPr>
       </w:pPr>
       <w:r>
         <w:t xml:space="preserve">☐ Automated backup verification (test restore periodically)</w:t>
       </w:r>
     </w:p>
-    <w:bookmarkEnd w:id="50"/>
-    <w:bookmarkStart w:id="51" w:name="integrating-the-library"/>
+    <w:bookmarkEnd w:id="51"/>
+    <w:bookmarkStart w:id="52" w:name="integrating-the-library"/>
     <w:p>
       <w:pPr>
         <w:pStyle w:val="Heading3"/>
@@ -7204,7 +7474,7 @@
         <w:pStyle w:val="Compact"/>
         <w:numPr>
           <w:ilvl w:val="0"/>
-          <w:numId w:val="1023"/>
+          <w:numId w:val="1024"/>
         </w:numPr>
       </w:pPr>
       <w:r>
@@ -7243,7 +7513,7 @@
         <w:pStyle w:val="Compact"/>
         <w:numPr>
           <w:ilvl w:val="0"/>
-          <w:numId w:val="1023"/>
+          <w:numId w:val="1024"/>
         </w:numPr>
       </w:pPr>
       <w:r>
@@ -7255,7 +7525,7 @@
         <w:pStyle w:val="Compact"/>
         <w:numPr>
           <w:ilvl w:val="0"/>
-          <w:numId w:val="1023"/>
+          <w:numId w:val="1024"/>
         </w:numPr>
       </w:pPr>
       <w:r>
@@ -7279,7 +7549,7 @@
         <w:pStyle w:val="Compact"/>
         <w:numPr>
           <w:ilvl w:val="0"/>
-          <w:numId w:val="1023"/>
+          <w:numId w:val="1024"/>
         </w:numPr>
       </w:pPr>
       <w:r>
@@ -7300,7 +7570,7 @@
         <w:pStyle w:val="Compact"/>
         <w:numPr>
           <w:ilvl w:val="0"/>
-          <w:numId w:val="1023"/>
+          <w:numId w:val="1024"/>
         </w:numPr>
       </w:pPr>
       <w:r>
@@ -7351,7 +7621,7 @@
         <w:pStyle w:val="Compact"/>
         <w:numPr>
           <w:ilvl w:val="0"/>
-          <w:numId w:val="1023"/>
+          <w:numId w:val="1024"/>
         </w:numPr>
       </w:pPr>
       <w:r>
@@ -7378,7 +7648,7 @@
         <w:pStyle w:val="Compact"/>
         <w:numPr>
           <w:ilvl w:val="0"/>
-          <w:numId w:val="1023"/>
+          <w:numId w:val="1024"/>
         </w:numPr>
       </w:pPr>
       <w:r>
@@ -7390,7 +7660,7 @@
         <w:pStyle w:val="Compact"/>
         <w:numPr>
           <w:ilvl w:val="0"/>
-          <w:numId w:val="1023"/>
+          <w:numId w:val="1024"/>
         </w:numPr>
       </w:pPr>
       <w:r>
@@ -7410,6 +7680,45 @@
       </w:r>
       <w:r>
         <w:t xml:space="preserve">with the derivation host</w:t>
+      </w:r>
+    </w:p>
+    <w:p>
+      <w:pPr>
+        <w:pStyle w:val="Compact"/>
+        <w:numPr>
+          <w:ilvl w:val="0"/>
+          <w:numId w:val="1024"/>
+        </w:numPr>
+      </w:pPr>
+      <w:r>
+        <w:t xml:space="preserve">☐ A passphrase the user brings: pass the input to</w:t>
+      </w:r>
+      <w:r>
+        <w:t xml:space="preserve"> </w:t>
+      </w:r>
+      <w:r>
+        <w:rPr>
+          <w:rStyle w:val="VerbatimChar"/>
+        </w:rPr>
+        <w:t xml:space="preserve">Recovery::validerPassphraseApportee()</w:t>
+      </w:r>
+      <w:r>
+        <w:t xml:space="preserve">, hash and show the returned form, set</w:t>
+      </w:r>
+      <w:r>
+        <w:t xml:space="preserve"> </w:t>
+      </w:r>
+      <w:r>
+        <w:rPr>
+          <w:rStyle w:val="VerbatimChar"/>
+        </w:rPr>
+        <w:t xml:space="preserve">autocapitalize="none"</w:t>
+      </w:r>
+      <w:r>
+        <w:t xml:space="preserve"> </w:t>
+      </w:r>
+      <w:r>
+        <w:t xml:space="preserve">on passphrase fields</w:t>
       </w:r>
     </w:p>
     <w:p>
@@ -7427,9 +7736,9 @@
         </w:pict>
       </w:r>
     </w:p>
-    <w:bookmarkEnd w:id="51"/>
     <w:bookmarkEnd w:id="52"/>
-    <w:bookmarkStart w:id="58" w:name="integration-guide"/>
+    <w:bookmarkEnd w:id="53"/>
+    <w:bookmarkStart w:id="59" w:name="integration-guide"/>
     <w:p>
       <w:pPr>
         <w:pStyle w:val="Heading2"/>
@@ -7438,7 +7747,7 @@
         <w:t xml:space="preserve">12. Integration Guide</w:t>
       </w:r>
     </w:p>
-    <w:bookmarkStart w:id="53" w:name="requirements"/>
+    <w:bookmarkStart w:id="54" w:name="requirements"/>
     <w:p>
       <w:pPr>
         <w:pStyle w:val="Heading3"/>
@@ -7452,7 +7761,7 @@
         <w:pStyle w:val="Compact"/>
         <w:numPr>
           <w:ilvl w:val="0"/>
-          <w:numId w:val="1024"/>
+          <w:numId w:val="1025"/>
         </w:numPr>
       </w:pPr>
       <w:r>
@@ -7548,7 +7857,7 @@
         <w:pStyle w:val="Compact"/>
         <w:numPr>
           <w:ilvl w:val="0"/>
-          <w:numId w:val="1024"/>
+          <w:numId w:val="1025"/>
         </w:numPr>
       </w:pPr>
       <w:r>
@@ -7599,7 +7908,7 @@
         <w:pStyle w:val="Compact"/>
         <w:numPr>
           <w:ilvl w:val="0"/>
-          <w:numId w:val="1024"/>
+          <w:numId w:val="1025"/>
         </w:numPr>
       </w:pPr>
       <w:r>
@@ -7683,15 +7992,15 @@
         <w:pStyle w:val="Compact"/>
         <w:numPr>
           <w:ilvl w:val="0"/>
-          <w:numId w:val="1024"/>
+          <w:numId w:val="1025"/>
         </w:numPr>
       </w:pPr>
       <w:r>
         <w:t xml:space="preserve">HTTPS mandatory on the ordinary web (§11.3)</w:t>
       </w:r>
     </w:p>
-    <w:bookmarkEnd w:id="53"/>
-    <w:bookmarkStart w:id="57" w:name="planned-distribution"/>
+    <w:bookmarkEnd w:id="54"/>
+    <w:bookmarkStart w:id="58" w:name="planned-distribution"/>
     <w:p>
       <w:pPr>
         <w:pStyle w:val="Heading3"/>
@@ -7766,7 +8075,7 @@
       <w:r>
         <w:t xml:space="preserve">repository. To see it at work: the served demo (</w:t>
       </w:r>
-      <w:hyperlink r:id="rId54">
+      <w:hyperlink r:id="rId55">
         <w:r>
           <w:rPr>
             <w:rStyle w:val="VerbatimChar"/>
@@ -7777,7 +8086,7 @@
       <w:r>
         <w:t xml:space="preserve">), the lab (</w:t>
       </w:r>
-      <w:hyperlink r:id="rId55">
+      <w:hyperlink r:id="rId56">
         <w:r>
           <w:rPr>
             <w:rStyle w:val="Hyperlink"/>
@@ -7791,7 +8100,7 @@
       <w:r>
         <w:t xml:space="preserve"> </w:t>
       </w:r>
-      <w:hyperlink r:id="rId56">
+      <w:hyperlink r:id="rId57">
         <w:r>
           <w:rPr>
             <w:rStyle w:val="Hyperlink"/>
@@ -7813,9 +8122,9 @@
         </w:pict>
       </w:r>
     </w:p>
-    <w:bookmarkEnd w:id="57"/>
     <w:bookmarkEnd w:id="58"/>
-    <w:bookmarkStart w:id="59" w:name="comparison-with-existing-solutions"/>
+    <w:bookmarkEnd w:id="59"/>
+    <w:bookmarkStart w:id="60" w:name="comparison-with-existing-solutions"/>
     <w:p>
       <w:pPr>
         <w:pStyle w:val="Heading2"/>
@@ -8326,8 +8635,8 @@
         </w:pict>
       </w:r>
     </w:p>
-    <w:bookmarkEnd w:id="59"/>
-    <w:bookmarkStart w:id="60" w:name="roadmap"/>
+    <w:bookmarkEnd w:id="60"/>
+    <w:bookmarkStart w:id="61" w:name="roadmap"/>
     <w:p>
       <w:pPr>
         <w:pStyle w:val="Heading2"/>
@@ -8341,19 +8650,19 @@
         <w:pStyle w:val="Compact"/>
         <w:numPr>
           <w:ilvl w:val="0"/>
-          <w:numId w:val="1025"/>
-        </w:numPr>
-      </w:pPr>
-      <w:r>
-        <w:t xml:space="preserve">☒ Protocol specification (v1.2)</w:t>
-      </w:r>
-    </w:p>
-    <w:p>
-      <w:pPr>
-        <w:pStyle w:val="Compact"/>
-        <w:numPr>
-          <w:ilvl w:val="0"/>
-          <w:numId w:val="1025"/>
+          <w:numId w:val="1026"/>
+        </w:numPr>
+      </w:pPr>
+      <w:r>
+        <w:t xml:space="preserve">☒ Protocol specification (v1.3)</w:t>
+      </w:r>
+    </w:p>
+    <w:p>
+      <w:pPr>
+        <w:pStyle w:val="Compact"/>
+        <w:numPr>
+          <w:ilvl w:val="0"/>
+          <w:numId w:val="1026"/>
         </w:numPr>
       </w:pPr>
       <w:r>
@@ -8365,7 +8674,7 @@
         <w:pStyle w:val="Compact"/>
         <w:numPr>
           <w:ilvl w:val="0"/>
-          <w:numId w:val="1025"/>
+          <w:numId w:val="1026"/>
         </w:numPr>
       </w:pPr>
       <w:r>
@@ -8377,7 +8686,7 @@
         <w:pStyle w:val="Compact"/>
         <w:numPr>
           <w:ilvl w:val="0"/>
-          <w:numId w:val="1025"/>
+          <w:numId w:val="1026"/>
         </w:numPr>
       </w:pPr>
       <w:r>
@@ -8407,7 +8716,7 @@
         <w:pStyle w:val="Compact"/>
         <w:numPr>
           <w:ilvl w:val="0"/>
-          <w:numId w:val="1025"/>
+          <w:numId w:val="1026"/>
         </w:numPr>
       </w:pPr>
       <w:r>
@@ -8446,7 +8755,7 @@
         <w:pStyle w:val="Compact"/>
         <w:numPr>
           <w:ilvl w:val="0"/>
-          <w:numId w:val="1025"/>
+          <w:numId w:val="1026"/>
         </w:numPr>
       </w:pPr>
       <w:r>
@@ -8467,7 +8776,7 @@
         <w:pStyle w:val="Compact"/>
         <w:numPr>
           <w:ilvl w:val="0"/>
-          <w:numId w:val="1025"/>
+          <w:numId w:val="1026"/>
         </w:numPr>
       </w:pPr>
       <w:r>
@@ -8506,7 +8815,7 @@
         <w:pStyle w:val="Compact"/>
         <w:numPr>
           <w:ilvl w:val="0"/>
-          <w:numId w:val="1025"/>
+          <w:numId w:val="1026"/>
         </w:numPr>
       </w:pPr>
       <w:r>
@@ -8542,7 +8851,7 @@
         <w:pStyle w:val="Compact"/>
         <w:numPr>
           <w:ilvl w:val="0"/>
-          <w:numId w:val="1025"/>
+          <w:numId w:val="1026"/>
         </w:numPr>
       </w:pPr>
       <w:r>
@@ -8554,7 +8863,7 @@
         <w:pStyle w:val="Compact"/>
         <w:numPr>
           <w:ilvl w:val="0"/>
-          <w:numId w:val="1025"/>
+          <w:numId w:val="1026"/>
         </w:numPr>
       </w:pPr>
       <w:r>
@@ -8566,7 +8875,7 @@
         <w:pStyle w:val="Compact"/>
         <w:numPr>
           <w:ilvl w:val="0"/>
-          <w:numId w:val="1025"/>
+          <w:numId w:val="1026"/>
         </w:numPr>
       </w:pPr>
       <w:r>
@@ -8587,7 +8896,28 @@
         <w:pStyle w:val="Compact"/>
         <w:numPr>
           <w:ilvl w:val="0"/>
-          <w:numId w:val="1025"/>
+          <w:numId w:val="1026"/>
+        </w:numPr>
+      </w:pPr>
+      <w:r>
+        <w:t xml:space="preserve">☒ A passphrase the user brings, rolled with dice (</w:t>
+      </w:r>
+      <w:r>
+        <w:rPr>
+          <w:rStyle w:val="VerbatimChar"/>
+        </w:rPr>
+        <w:t xml:space="preserve">Recovery::validerPassphraseApportee</w:t>
+      </w:r>
+      <w:r>
+        <w:t xml:space="preserve">)</w:t>
+      </w:r>
+    </w:p>
+    <w:p>
+      <w:pPr>
+        <w:pStyle w:val="Compact"/>
+        <w:numPr>
+          <w:ilvl w:val="0"/>
+          <w:numId w:val="1026"/>
         </w:numPr>
       </w:pPr>
       <w:r>
@@ -8599,7 +8929,7 @@
         <w:pStyle w:val="Compact"/>
         <w:numPr>
           <w:ilvl w:val="0"/>
-          <w:numId w:val="1025"/>
+          <w:numId w:val="1026"/>
         </w:numPr>
       </w:pPr>
       <w:r>
@@ -8620,7 +8950,7 @@
         <w:pStyle w:val="Compact"/>
         <w:numPr>
           <w:ilvl w:val="0"/>
-          <w:numId w:val="1025"/>
+          <w:numId w:val="1026"/>
         </w:numPr>
       </w:pPr>
       <w:r>
@@ -8653,7 +8983,7 @@
         <w:pStyle w:val="Compact"/>
         <w:numPr>
           <w:ilvl w:val="0"/>
-          <w:numId w:val="1025"/>
+          <w:numId w:val="1026"/>
         </w:numPr>
       </w:pPr>
       <w:r>
@@ -8665,7 +8995,7 @@
         <w:pStyle w:val="Compact"/>
         <w:numPr>
           <w:ilvl w:val="0"/>
-          <w:numId w:val="1025"/>
+          <w:numId w:val="1026"/>
         </w:numPr>
       </w:pPr>
       <w:r>
@@ -8677,7 +9007,7 @@
         <w:pStyle w:val="Compact"/>
         <w:numPr>
           <w:ilvl w:val="0"/>
-          <w:numId w:val="1025"/>
+          <w:numId w:val="1026"/>
         </w:numPr>
       </w:pPr>
       <w:r>
@@ -8691,8 +9021,8 @@
         </w:pict>
       </w:r>
     </w:p>
-    <w:bookmarkEnd w:id="60"/>
-    <w:bookmarkStart w:id="61" w:name="contributing"/>
+    <w:bookmarkEnd w:id="61"/>
+    <w:bookmarkStart w:id="62" w:name="contributing"/>
     <w:p>
       <w:pPr>
         <w:pStyle w:val="Heading2"/>
@@ -8714,7 +9044,7 @@
         <w:pStyle w:val="Compact"/>
         <w:numPr>
           <w:ilvl w:val="0"/>
-          <w:numId w:val="1026"/>
+          <w:numId w:val="1027"/>
         </w:numPr>
       </w:pPr>
       <w:r>
@@ -8726,7 +9056,7 @@
         <w:pStyle w:val="Compact"/>
         <w:numPr>
           <w:ilvl w:val="0"/>
-          <w:numId w:val="1026"/>
+          <w:numId w:val="1027"/>
         </w:numPr>
       </w:pPr>
       <w:r>
@@ -8738,7 +9068,7 @@
         <w:pStyle w:val="Compact"/>
         <w:numPr>
           <w:ilvl w:val="0"/>
-          <w:numId w:val="1026"/>
+          <w:numId w:val="1027"/>
         </w:numPr>
       </w:pPr>
       <w:r>
@@ -8782,8 +9112,8 @@
         <w:t xml:space="preserve">SelfRecover — because an identity shouldn’t depend on an inbox.</w:t>
       </w:r>
     </w:p>
-    <w:bookmarkEnd w:id="61"/>
     <w:bookmarkEnd w:id="62"/>
+    <w:bookmarkEnd w:id="63"/>
     <w:sectPr/>
   </w:body>
 </w:document>
@@ -9045,6 +9375,9 @@
     <w:abstractNumId w:val="991"/>
   </w:num>
   <w:num w:numId="1026">
+    <w:abstractNumId w:val="991"/>
+  </w:num>
+  <w:num w:numId="1027">
     <w:abstractNumId w:val="991"/>
   </w:num>
 </w:numbering>

</xml_diff>

<commit_message>
docs(selfrecover): relecture de la prose de la 0.10.0
Co-Authored-By: Claude Opus 5.5 <noreply@anthropic.com>
</commit_message>
<xml_diff>
--- a/bi-self/selfrecover/docs/whitepaper-en.docx
+++ b/bi-self/selfrecover/docs/whitepaper-en.docx
@@ -4178,13 +4178,13 @@
       </w:r>
     </w:p>
     <w:bookmarkEnd w:id="34"/>
-    <w:bookmarkStart w:id="35" w:name="Xd043ed50251bcf9cfe2fe65a0fd7d02301ba0f6"/>
+    <w:bookmarkStart w:id="35" w:name="a-passphrase-the-user-brings"/>
     <w:p>
       <w:pPr>
         <w:pStyle w:val="Heading3"/>
       </w:pPr>
       <w:r>
-        <w:t xml:space="preserve">5.5 A passphrase the user brings — the user’s choice</w:t>
+        <w:t xml:space="preserve">5.5 A passphrase the user brings</w:t>
       </w:r>
     </w:p>
     <w:p>

</xml_diff>

<commit_message>
docs(selfrecover) : « mot de récupération seul = rien » vaut pour le compte, pas pour les données
La phrase était fausse dès que SelfDataGuard est branché : le mot ouvre aussi
les données, comme serrure de secours voulue, qui vaut ce que vaut le mot. Elle
est corrigée, pas retirée, à ses cinq porteurs (README fr/en, whitepapers fr/en,
architecture), et la phrase « une fuite de base ne l'expose pas » des deux
README dit ce qu'elle couvre. Les deux DOCX sont régénérés depuis leur source.

Co-Authored-By: Claude Opus 5.5 <noreply@anthropic.com>
Signed-off-by: Pierroons <97373452+Pierroons@users.noreply.github.com>
</commit_message>
<xml_diff>
--- a/bi-self/selfrecover/docs/whitepaper-en.docx
+++ b/bi-self/selfrecover/docs/whitepaper-en.docx
@@ -309,7 +309,7 @@
         <w:pStyle w:val="BlockText"/>
       </w:pPr>
       <w:r>
-        <w:t xml:space="preserve">Recovery word alone = nothing.</w:t>
+        <w:t xml:space="preserve">Recovery word alone = nothing for the account.</w:t>
       </w:r>
       <w:r>
         <w:t xml:space="preserve"> </w:t>
@@ -330,6 +330,30 @@
       </w:pPr>
       <w:r>
         <w:t xml:space="preserve">SelfRecover is a split-knowledge recovery system. The user remembers one word. The system provides the algorithm. Neither has value without the other.</w:t>
+      </w:r>
+    </w:p>
+    <w:p>
+      <w:pPr>
+        <w:pStyle w:val="BodyText"/>
+      </w:pPr>
+      <w:r>
+        <w:t xml:space="preserve">⚠️</w:t>
+      </w:r>
+      <w:r>
+        <w:t xml:space="preserve"> </w:t>
+      </w:r>
+      <w:r>
+        <w:rPr>
+          <w:b/>
+          <w:bCs/>
+        </w:rPr>
+        <w:t xml:space="preserve">With SelfDataGuard, the word also opens the data.</w:t>
+      </w:r>
+      <w:r>
+        <w:t xml:space="preserve"> </w:t>
+      </w:r>
+      <w:r>
+        <w:t xml:space="preserve">It is an intended fallback lock: it gives the data back to a user who has lost everything but this word. It is as strong as the word, and no other factor is added to it.</w:t>
       </w:r>
     </w:p>
     <w:p>

</xml_diff>